<commit_message>
Documentos: contratos tokenizados (função, remuneração, atividades, e-mail, equipamentos)
Insere campos {{}} nas células em branco do QUADRO SINTÉTICO dos 4 contratos + 3
blocos de equipamento (home office/aditivo) — sem alterar cláusula, só transforma
o espaço em campo. Catálogo atualizado em sincronia; remuneração/atividades como
textarea no app. Agora os contratos saem preenchidos do app, sem digitar à mão.

Co-Authored-By: Claude Opus 4.8 <noreply@anthropic.com>
</commit_message>
<xml_diff>
--- a/api/_docrh/modelos/aditivo-home-office-hibrido.docx
+++ b/api/_docrh/modelos/aditivo-home-office-hibrido.docx
@@ -824,6 +824,9 @@
                 <w:highlight w:val="yellow"/>
               </w:rPr>
             </w:pPr>
+            <w:r>
+              <w:t>{{EMAIL_CONTATO}}</w:t>
+            </w:r>
           </w:p>
         </w:tc>
       </w:tr>
@@ -4882,6 +4885,9 @@
                 <w:szCs w:val="20"/>
               </w:rPr>
             </w:pPr>
+            <w:r>
+              <w:t>{{EQUIP1_TIPO}}</w:t>
+            </w:r>
           </w:p>
         </w:tc>
       </w:tr>
@@ -4940,6 +4946,9 @@
                 <w:szCs w:val="20"/>
               </w:rPr>
             </w:pPr>
+            <w:r>
+              <w:t>{{EQUIP1_MARCA}}</w:t>
+            </w:r>
           </w:p>
         </w:tc>
       </w:tr>
@@ -4998,6 +5007,9 @@
                 <w:szCs w:val="20"/>
               </w:rPr>
             </w:pPr>
+            <w:r>
+              <w:t>{{EQUIP1_MODELO}}</w:t>
+            </w:r>
           </w:p>
         </w:tc>
       </w:tr>
@@ -5056,6 +5068,9 @@
                 <w:szCs w:val="20"/>
               </w:rPr>
             </w:pPr>
+            <w:r>
+              <w:t>{{EQUIP1_SERIE}}</w:t>
+            </w:r>
           </w:p>
         </w:tc>
       </w:tr>
@@ -5152,6 +5167,9 @@
                 <w:szCs w:val="20"/>
               </w:rPr>
             </w:pPr>
+            <w:r>
+              <w:t>{{EQUIP2_TIPO}}</w:t>
+            </w:r>
           </w:p>
         </w:tc>
       </w:tr>
@@ -5210,6 +5228,9 @@
                 <w:szCs w:val="20"/>
               </w:rPr>
             </w:pPr>
+            <w:r>
+              <w:t>{{EQUIP2_MARCA}}</w:t>
+            </w:r>
           </w:p>
         </w:tc>
       </w:tr>
@@ -5268,6 +5289,9 @@
                 <w:szCs w:val="20"/>
               </w:rPr>
             </w:pPr>
+            <w:r>
+              <w:t>{{EQUIP2_MODELO}}</w:t>
+            </w:r>
           </w:p>
         </w:tc>
       </w:tr>
@@ -5333,6 +5357,9 @@
                 <w:szCs w:val="20"/>
               </w:rPr>
             </w:pPr>
+            <w:r>
+              <w:t>{{EQUIP2_SERIE}}</w:t>
+            </w:r>
           </w:p>
         </w:tc>
       </w:tr>
@@ -5429,6 +5456,9 @@
                 <w:szCs w:val="20"/>
               </w:rPr>
             </w:pPr>
+            <w:r>
+              <w:t>{{EQUIP3_TIPO}}</w:t>
+            </w:r>
           </w:p>
         </w:tc>
       </w:tr>
@@ -5487,6 +5517,9 @@
                 <w:szCs w:val="20"/>
               </w:rPr>
             </w:pPr>
+            <w:r>
+              <w:t>{{EQUIP3_MARCA}}</w:t>
+            </w:r>
           </w:p>
         </w:tc>
       </w:tr>
@@ -5545,6 +5578,9 @@
                 <w:szCs w:val="20"/>
               </w:rPr>
             </w:pPr>
+            <w:r>
+              <w:t>{{EQUIP3_MODELO}}</w:t>
+            </w:r>
           </w:p>
         </w:tc>
       </w:tr>
@@ -5603,6 +5639,9 @@
                 <w:szCs w:val="20"/>
               </w:rPr>
             </w:pPr>
+            <w:r>
+              <w:t>{{EQUIP3_SERIE}}</w:t>
+            </w:r>
           </w:p>
         </w:tc>
       </w:tr>

</xml_diff>